<commit_message>
Remove Raspberry Pi wording from the presentation files
- Slides, notes, tables and the explanation/script documents now describe
  collection by the capture program on the laptop microphone and webcam instead
  of a Raspberry Pi. Edits are run-level, so formatting is unchanged; the 23
  slides are intact. The earlier versions remain in Git history.
- The slide 6 hyperlink pointed at the deleted Pi-era block diagram; it now
  opens the current flow animation (../../PetMind_동작_애니메이션.html).
- 발표자료/README.md notes what was changed.

Co-Authored-By: Claude Sonnet 5.5 <noreply@anthropic.com>
</commit_message>
<xml_diff>
--- a/docs/presentation/PetMind_설명.docx
+++ b/docs/presentation/PetMind_설명.docx
@@ -178,7 +178,7 @@
         <w:t xml:space="preserve">말할 내용  </w:t>
       </w:r>
       <w:r>
-        <w:t>Raspberry Pi는 마이크와 카메라의 입력을 수집하고, PC 프로그램은 소리를 분석해 관찰 기록을 저장합니다. 보호자는 웹 화면에서 최근 장면과 원본을 확인하고 의견을 남깁니다. 질문이 들어오면 같은 반려견의 관련 기록을 찾아 설명에 활용합니다. 이 HTML은 현재 운영 구조이고, YAMNet과 결합 LSTM은 뒤에서 설명할 별도 실험입니다.</w:t>
+        <w:t>수집 프로그램은 노트북 마이크와 웹캠의 입력을 수집하고, 분석 프로그램은 소리를 분석해 관찰 기록을 저장합니다. 보호자는 웹 화면에서 최근 장면과 원본을 확인하고 의견을 남깁니다. 질문이 들어오면 같은 반려견의 관련 기록을 찾아 설명에 활용합니다. 이 HTML은 현재 운영 구조이고, YAMNet과 결합 LSTM은 뒤에서 설명할 별도 실험입니다.</w:t>
       </w:r>
     </w:p>
     <w:p>
@@ -213,7 +213,7 @@
         <w:t xml:space="preserve">말할 내용  </w:t>
       </w:r>
       <w:r>
-        <w:t>외출을 시작하면 저장 동의를 받고 외출 기록을 만듭니다. Pi 프로그램이 녹음과 촬영을 시작하고, 짧은 구간을 분석한 뒤 결과와 영상을 연결하도록 구현했습니다. 귀가 버튼을 누르면 남은 구간을 저장하고 수집을 종료합니다. 현재 화면과 서버의 흐름, 준비한 파일 입력은 확인했으며 실제 마이크와 카메라의 장시간 연결 시험은 남아 있습니다.</w:t>
+        <w:t>외출을 시작하면 저장 동의를 받고 외출 기록을 만듭니다. 수집 프로그램이 녹음과 촬영을 시작하고, 짧은 구간을 분석한 뒤 결과와 영상을 연결하도록 구현했습니다. 귀가 버튼을 누르면 남은 구간을 저장하고 수집을 종료합니다. 현재 화면과 서버의 흐름, 준비한 파일 입력은 확인했으며 실제 마이크와 카메라의 장시간 연결 시험은 남아 있습니다.</w:t>
       </w:r>
     </w:p>
     <w:p>
@@ -503,7 +503,7 @@
         <w:t xml:space="preserve">말할 내용  </w:t>
       </w:r>
       <w:r>
-        <w:t>카메라는 소리만으로 알 수 없는 상황을 보호자가 확인하는 데 사용합니다. 짖음 후보가 생기면 최근 영상에서 앞뒤 장면을 연결해 저장합니다. 30초 시험 파일에서는 소리 기록 여섯 개와 15초 영상을 생성해 확인했습니다. 실제 Pi에서는 소리와 영상의 시각이 맞는지, 오래 동작해도 안정적인지를 추가로 시험해야 합니다.</w:t>
+        <w:t>카메라는 소리만으로 알 수 없는 상황을 보호자가 확인하는 데 사용합니다. 짖음 후보가 생기면 최근 영상에서 앞뒤 장면을 연결해 저장합니다. 30초 시험 파일에서는 소리 기록 여섯 개와 15초 영상을 생성해 확인했습니다. 실제 노트북 마이크·웹캠에서는 소리와 영상의 시각이 맞는지, 오래 동작해도 안정적인지를 추가로 시험해야 합니다.</w:t>
       </w:r>
     </w:p>
     <w:p>
@@ -633,7 +633,7 @@
         <w:t xml:space="preserve">말할 내용  </w:t>
       </w:r>
       <w:r>
-        <w:t>현재 외출 기록과 원본 연결, 보호자 의견, 귀가 요약을 이어서 보여줄 수 있습니다. 음성 모델은 공개 자료로 여러 후보를 비교했고 RAG 설명 검증도 보완했습니다. Python 테스트 156개와 Flutter 테스트 21개가 통과한 기록이 있습니다. 다만 실제 Pi의 장시간 수집, 실제 가정 감지 성능, 실제 보호자의 질문 검증은 남아 있습니다.</w:t>
+        <w:t>현재 외출 기록과 원본 연결, 보호자 의견, 귀가 요약을 이어서 보여줄 수 있습니다. 음성 모델은 공개 자료로 여러 후보를 비교했고 RAG 설명 검증도 보완했습니다. Python 테스트 156개와 Flutter 테스트 21개가 통과한 기록이 있습니다. 다만 실제 장비의 장시간 수집, 실제 가정 감지 성능, 실제 보호자의 질문 검증은 남아 있습니다.</w:t>
       </w:r>
     </w:p>
     <w:p>
@@ -1016,7 +1016,7 @@
         <w:rPr>
           <w:sz w:val="20"/>
         </w:rPr>
-        <w:t>수집 프로그램과 서버·화면의 연결 구조는 구현했고 파일 입력과 일부 Pi 통신을 확인했습니다. 실제 마이크·카메라 연속 수집, 시각 동기화, 연결 끊김 후 복구와 장시간 안정성은 추가 검증이 필요합니다.</w:t>
+        <w:t>수집 프로그램과 서버·화면의 연결 구조는 구현했고 파일 입력을 확인했습니다. 실제 마이크·카메라 연속 수집, 시각 동기화, 연결 끊김 후 복구와 장시간 안정성은 추가 검증이 필요합니다.</w:t>
       </w:r>
     </w:p>
     <w:p>

</xml_diff>